<commit_message>
Document updated. Script file updated.
</commit_message>
<xml_diff>
--- a/Azure-Practices/AzureServiceBus/ShoppingMicroServices/Azure-POC-Documents/Tutorials-From-AzureServBus-POC/Microservices-ApiManagement.docx
+++ b/Azure-Practices/AzureServiceBus/ShoppingMicroServices/Azure-POC-Documents/Tutorials-From-AzureServBus-POC/Microservices-ApiManagement.docx
@@ -87,8 +87,13 @@
         <w:t>Name</w:t>
       </w:r>
       <w:r>
-        <w:t>: e.g., TestMskAPIM</w:t>
-      </w:r>
+        <w:t xml:space="preserve">: e.g., </w:t>
+      </w:r>
+      <w:proofErr w:type="spellStart"/>
+      <w:r>
+        <w:t>TestMskAPIM</w:t>
+      </w:r>
+      <w:proofErr w:type="spellEnd"/>
     </w:p>
     <w:p>
       <w:pPr>
@@ -105,8 +110,13 @@
         <w:t>Resource Group</w:t>
       </w:r>
       <w:r>
-        <w:t>: TestMskRsGrp</w:t>
-      </w:r>
+        <w:t xml:space="preserve">: </w:t>
+      </w:r>
+      <w:proofErr w:type="spellStart"/>
+      <w:r>
+        <w:t>TestMskRsGrp</w:t>
+      </w:r>
+      <w:proofErr w:type="spellEnd"/>
     </w:p>
     <w:p>
       <w:pPr>
@@ -258,7 +268,15 @@
         <w:t>Display name</w:t>
       </w:r>
       <w:r>
-        <w:t>: OrderService API</w:t>
+        <w:t xml:space="preserve">: </w:t>
+      </w:r>
+      <w:proofErr w:type="spellStart"/>
+      <w:r>
+        <w:t>OrderService</w:t>
+      </w:r>
+      <w:proofErr w:type="spellEnd"/>
+      <w:r>
+        <w:t xml:space="preserve"> API</w:t>
       </w:r>
     </w:p>
     <w:p>
@@ -276,8 +294,13 @@
         <w:t>Name</w:t>
       </w:r>
       <w:r>
-        <w:t>: orderservice</w:t>
-      </w:r>
+        <w:t xml:space="preserve">: </w:t>
+      </w:r>
+      <w:proofErr w:type="spellStart"/>
+      <w:r>
+        <w:t>orderservice</w:t>
+      </w:r>
+      <w:proofErr w:type="spellEnd"/>
     </w:p>
     <w:p>
       <w:pPr>
@@ -312,7 +335,37 @@
         <w:t>API URL suffix</w:t>
       </w:r>
       <w:r>
-        <w:t>: orderservice</w:t>
+        <w:t xml:space="preserve">: </w:t>
+      </w:r>
+      <w:proofErr w:type="spellStart"/>
+      <w:r>
+        <w:t>orderservice</w:t>
+      </w:r>
+      <w:proofErr w:type="spellEnd"/>
+    </w:p>
+    <w:p>
+      <w:pPr>
+        <w:numPr>
+          <w:ilvl w:val="1"/>
+          <w:numId w:val="2"/>
+        </w:numPr>
+      </w:pPr>
+      <w:r>
+        <w:t>order-service-</w:t>
+      </w:r>
+      <w:proofErr w:type="spellStart"/>
+      <w:r>
+        <w:t>ip</w:t>
+      </w:r>
+      <w:proofErr w:type="spellEnd"/>
+      <w:r>
+        <w:t xml:space="preserve"> </w:t>
+      </w:r>
+      <w:r>
+        <w:t xml:space="preserve"> = </w:t>
+      </w:r>
+      <w:r>
+        <w:t>52.172.92.137</w:t>
       </w:r>
     </w:p>
     <w:p>
@@ -327,15 +380,7 @@
     </w:p>
     <w:p>
       <w:r>
-        <w:t>https://&lt;apim-instance-name</w:t>
-      </w:r>
-      <w:proofErr w:type="gramStart"/>
-      <w:r>
-        <w:t>&gt;.azure-api.net</w:t>
-      </w:r>
-      <w:proofErr w:type="gramEnd"/>
-      <w:r>
-        <w:t>/orderservice/api/order/TestOrder</w:t>
+        <w:t>https://&lt;apim-instance-name&gt;.azure-api.net/orderservice/api/order/TestOrder</w:t>
       </w:r>
     </w:p>
     <w:p>
@@ -418,8 +463,21 @@
         <w:t>URL</w:t>
       </w:r>
       <w:r>
-        <w:t>: /api/order/TestOrder</w:t>
-      </w:r>
+        <w:t>: /</w:t>
+      </w:r>
+      <w:proofErr w:type="spellStart"/>
+      <w:r>
+        <w:t>api</w:t>
+      </w:r>
+      <w:proofErr w:type="spellEnd"/>
+      <w:r>
+        <w:t>/order/</w:t>
+      </w:r>
+      <w:proofErr w:type="spellStart"/>
+      <w:r>
+        <w:t>TestOrder</w:t>
+      </w:r>
+      <w:proofErr w:type="spellEnd"/>
     </w:p>
     <w:p>
       <w:pPr>
@@ -494,36 +552,60 @@
         </w:numPr>
       </w:pPr>
       <w:r>
-        <w:t>Insert &lt;validate-jwt&gt; policy:</w:t>
-      </w:r>
-    </w:p>
-    <w:p>
-      <w:r>
+        <w:t>Insert &lt;validate-</w:t>
+      </w:r>
+      <w:proofErr w:type="spellStart"/>
+      <w:r>
+        <w:t>jwt</w:t>
+      </w:r>
+      <w:proofErr w:type="spellEnd"/>
+      <w:r>
+        <w:t>&gt; policy:</w:t>
+      </w:r>
+    </w:p>
+    <w:p>
+      <w:r>
+        <w:lastRenderedPageBreak/>
         <w:t>xml</w:t>
       </w:r>
     </w:p>
     <w:p>
       <w:r>
-        <w:lastRenderedPageBreak/>
         <w:t>&lt;inbound&gt;</w:t>
       </w:r>
     </w:p>
     <w:p>
       <w:r>
-        <w:t xml:space="preserve">  &lt;validate-jwt header-name="Authorization" failed-validation-httpcode="401" failed-validation-error-message="Unauthorized"&gt;</w:t>
-      </w:r>
-    </w:p>
-    <w:p>
-      <w:r>
-        <w:t xml:space="preserve">    &lt;openid-config url="https://login.microsoftonline.com/&lt;tenant-id&gt;/v2.0</w:t>
-      </w:r>
-      <w:proofErr w:type="gramStart"/>
-      <w:r>
-        <w:t>/.well</w:t>
-      </w:r>
-      <w:proofErr w:type="gramEnd"/>
-      <w:r>
-        <w:t>-known/openid-configuration" /&gt;</w:t>
+        <w:t xml:space="preserve">  &lt;validate-</w:t>
+      </w:r>
+      <w:proofErr w:type="spellStart"/>
+      <w:r>
+        <w:t>jwt</w:t>
+      </w:r>
+      <w:proofErr w:type="spellEnd"/>
+      <w:r>
+        <w:t xml:space="preserve"> header-name="Authorization" failed-validation-</w:t>
+      </w:r>
+      <w:proofErr w:type="spellStart"/>
+      <w:r>
+        <w:t>httpcode</w:t>
+      </w:r>
+      <w:proofErr w:type="spellEnd"/>
+      <w:r>
+        <w:t>="401" failed-validation-error-message="Unauthorized"&gt;</w:t>
+      </w:r>
+    </w:p>
+    <w:p>
+      <w:r>
+        <w:t xml:space="preserve">    &lt;</w:t>
+      </w:r>
+      <w:proofErr w:type="spellStart"/>
+      <w:r>
+        <w:t>openid</w:t>
+      </w:r>
+      <w:proofErr w:type="spellEnd"/>
+      <w:r>
+        <w:t>-config url="https://login.microsoftonline.com/&lt;tenant-id&gt;/v2.0/.well-known/openid-configuration" /&gt;</w:t>
       </w:r>
     </w:p>
     <w:p>
@@ -533,7 +615,15 @@
     </w:p>
     <w:p>
       <w:r>
-        <w:t xml:space="preserve">      &lt;claim name="aud" match="any"&gt;</w:t>
+        <w:t xml:space="preserve">      &lt;claim name="</w:t>
+      </w:r>
+      <w:proofErr w:type="spellStart"/>
+      <w:r>
+        <w:t>aud</w:t>
+      </w:r>
+      <w:proofErr w:type="spellEnd"/>
+      <w:r>
+        <w:t>" match="any"&gt;</w:t>
       </w:r>
     </w:p>
     <w:p>
@@ -553,7 +643,15 @@
     </w:p>
     <w:p>
       <w:r>
-        <w:t xml:space="preserve">  &lt;/validate-jwt&gt;</w:t>
+        <w:t xml:space="preserve">  &lt;/validate-</w:t>
+      </w:r>
+      <w:proofErr w:type="spellStart"/>
+      <w:r>
+        <w:t>jwt</w:t>
+      </w:r>
+      <w:proofErr w:type="spellEnd"/>
+      <w:r>
+        <w:t>&gt;</w:t>
       </w:r>
     </w:p>
     <w:p>
@@ -620,21 +718,21 @@
     </w:p>
     <w:p>
       <w:r>
-        <w:t>&lt;rate-limit-by-key calls="10" renewal-period="60" counter-key="</w:t>
-      </w:r>
-      <w:proofErr w:type="gramStart"/>
-      <w:r>
-        <w:t>@(context.Subscription?.</w:t>
-      </w:r>
-      <w:proofErr w:type="gramEnd"/>
-      <w:r>
-        <w:t xml:space="preserve">Key ?? </w:t>
-      </w:r>
-      <w:proofErr w:type="gramStart"/>
+        <w:t>&lt;rate-limit-by-key calls="10" renewal-period="60" counter-key="@(</w:t>
+      </w:r>
+      <w:proofErr w:type="spellStart"/>
+      <w:r>
+        <w:t>context.Subscription?.Key</w:t>
+      </w:r>
+      <w:proofErr w:type="spellEnd"/>
+      <w:r>
+        <w:t xml:space="preserve"> ?? </w:t>
+      </w:r>
+      <w:proofErr w:type="spellStart"/>
       <w:r>
         <w:t>context.Request.IpAddress</w:t>
       </w:r>
-      <w:proofErr w:type="gramEnd"/>
+      <w:proofErr w:type="spellEnd"/>
       <w:r>
         <w:t>)" /&gt;</w:t>
       </w:r>
@@ -704,25 +802,41 @@
     </w:p>
     <w:p>
       <w:r>
-        <w:t>curl https://&lt;apim-instance-name</w:t>
-      </w:r>
-      <w:proofErr w:type="gramStart"/>
-      <w:r>
-        <w:t>&gt;.azure-api.net</w:t>
-      </w:r>
-      <w:proofErr w:type="gramEnd"/>
-      <w:r>
-        <w:t>/orderservice/api/order/TestOrder \</w:t>
-      </w:r>
-    </w:p>
-    <w:p>
-      <w:r>
-        <w:t xml:space="preserve">  -H "Ocp-Apim-Subscription-Key: &lt;your-subscription-key&gt;" \</w:t>
-      </w:r>
-    </w:p>
-    <w:p>
-      <w:r>
-        <w:t xml:space="preserve">  -H "Authorization: Bearer &lt;valid-jwt&gt;"</w:t>
+        <w:t>curl https://&lt;apim-instance-name&gt;.azure-api.net/orderservice/api/order/TestOrder \</w:t>
+      </w:r>
+    </w:p>
+    <w:p>
+      <w:r>
+        <w:t xml:space="preserve">  -H "</w:t>
+      </w:r>
+      <w:proofErr w:type="spellStart"/>
+      <w:r>
+        <w:t>Ocp</w:t>
+      </w:r>
+      <w:proofErr w:type="spellEnd"/>
+      <w:r>
+        <w:t>-</w:t>
+      </w:r>
+      <w:proofErr w:type="spellStart"/>
+      <w:r>
+        <w:t>Apim</w:t>
+      </w:r>
+      <w:proofErr w:type="spellEnd"/>
+      <w:r>
+        <w:t>-Subscription-Key: &lt;your-subscription-key&gt;" \</w:t>
+      </w:r>
+    </w:p>
+    <w:p>
+      <w:r>
+        <w:t xml:space="preserve">  -H "Authorization: Bearer &lt;valid-</w:t>
+      </w:r>
+      <w:proofErr w:type="spellStart"/>
+      <w:r>
+        <w:t>jwt</w:t>
+      </w:r>
+      <w:proofErr w:type="spellEnd"/>
+      <w:r>
+        <w:t>&gt;"</w:t>
       </w:r>
     </w:p>
     <w:p>
@@ -744,7 +858,15 @@
         </w:numPr>
       </w:pPr>
       <w:r>
-        <w:t>Valid JWT → forwards to OrderService and returns response.</w:t>
+        <w:t xml:space="preserve">Valid JWT → forwards to </w:t>
+      </w:r>
+      <w:proofErr w:type="spellStart"/>
+      <w:r>
+        <w:t>OrderService</w:t>
+      </w:r>
+      <w:proofErr w:type="spellEnd"/>
+      <w:r>
+        <w:t xml:space="preserve"> and returns response.</w:t>
       </w:r>
     </w:p>
     <w:p>
@@ -782,6 +904,7 @@
           <w:b/>
           <w:bCs/>
         </w:rPr>
+        <w:lastRenderedPageBreak/>
         <w:t>✅</w:t>
       </w:r>
       <w:r>
@@ -804,7 +927,6 @@
           <w:b/>
           <w:bCs/>
         </w:rPr>
-        <w:lastRenderedPageBreak/>
         <w:t>APIM service creation is mandatory</w:t>
       </w:r>
       <w:r>
@@ -840,7 +962,31 @@
         </w:numPr>
       </w:pPr>
       <w:r>
-        <w:t>Define operations for each endpoint (GET /api/order/TestOrder, POST /api/order/place, etc.).</w:t>
+        <w:t>Define operations for each endpoint (GET /</w:t>
+      </w:r>
+      <w:proofErr w:type="spellStart"/>
+      <w:r>
+        <w:t>api</w:t>
+      </w:r>
+      <w:proofErr w:type="spellEnd"/>
+      <w:r>
+        <w:t>/order/</w:t>
+      </w:r>
+      <w:proofErr w:type="spellStart"/>
+      <w:r>
+        <w:t>TestOrder</w:t>
+      </w:r>
+      <w:proofErr w:type="spellEnd"/>
+      <w:r>
+        <w:t>, POST /</w:t>
+      </w:r>
+      <w:proofErr w:type="spellStart"/>
+      <w:r>
+        <w:t>api</w:t>
+      </w:r>
+      <w:proofErr w:type="spellEnd"/>
+      <w:r>
+        <w:t>/order/place, etc.).</w:t>
       </w:r>
     </w:p>
     <w:p>
@@ -2568,6 +2714,7 @@
   <w:style w:type="character" w:default="1" w:styleId="DefaultParagraphFont">
     <w:name w:val="Default Paragraph Font"/>
     <w:uiPriority w:val="1"/>
+    <w:semiHidden/>
     <w:unhideWhenUsed/>
   </w:style>
   <w:style w:type="table" w:default="1" w:styleId="TableNormal">

</xml_diff>